<commit_message>
Báo cáo cuối kỳ hoàn chỉnh: lưu đồ thuật toán, phân tích, PDF, slide
- Cuốn báo cáo hoàn chỉnh (docx + pdf): 12 lưu đồ Hình 3.3–3.8 kèm phân
  tích thuật toán; sửa Bảng 3.5, Bảng 3.7 cho khớp code
- docs/bao-cao/hinh/luu-do-thuat-toan: ảnh lưu đồ dùng trong báo cáo
- docs/bao-cao/ppt-final: slide trình bày
- README: mục hồ sơ nộp bài (báo cáo, video demo, lưu đồ, slide)

Co-Authored-By: Claude Opus 5.5 <noreply@anthropic.com>
</commit_message>
<xml_diff>
--- a/docs/bao-cao/BaoCao_Chuong2_CoSoLyThuyet.docx
+++ b/docs/bao-cao/BaoCao_Chuong2_CoSoLyThuyet.docx
@@ -328,7 +328,7 @@
           <w:b w:val="0"/>
           <w:i w:val="0"/>
         </w:rPr>
-        <w:t>Các nghiên cứu phân loại rác thường huấn luyện mạng tích chập (CNN) trên tập ảnh có nhãn, ví dụ TrashNet [3] (6 loại vật liệu) hay MobileNetV2 [4]. Hạn chế: cần dữ liệu lớn cho đúng các nhóm của bài toán, và muốn đổi nhóm phải huấn luyện lại.</w:t>
+        <w:t>Các nghiên cứu phân loại rác thường huấn luyện mạng tích chập (CNN) trên tập ảnh có nhãn, ví dụ TrashNet [3] với 6 loại vật liệu. Hạn chế: cần dữ liệu lớn cho đúng các nhóm của bài toán, và muốn đổi nhóm phải huấn luyện lại.</w:t>
       </w:r>
     </w:p>
     <w:p>
@@ -388,7 +388,7 @@
           <w:b w:val="0"/>
           <w:i w:val="0"/>
         </w:rPr>
-        <w:t>MobileCLIP [1] (Apple, CVPR 2024) là họ mô hình CLIP thiết kế cho thiết bị di động, huấn luyện theo phương pháp "multi-modal reinforced training" để giữ độ chính xác cao với độ trễ thấp. Bản nhỏ nhất MobileCLIP-S0 có bộ mã hoá ảnh lai CNN–Transformer, đầu vào 256×256, đầu ra vector 512 chiều. Hướng zero-shot bằng mô hình thị giác – ngôn ngữ cũng đã được áp dụng cho phân loại rác nhựa trong [7].</w:t>
+        <w:t>MobileCLIP [1] (Apple, CVPR 2024) là họ mô hình CLIP thiết kế cho thiết bị di động, huấn luyện theo phương pháp "multi-modal reinforced training" để giữ độ chính xác cao với độ trễ thấp. Bản nhỏ nhất MobileCLIP-S0 có bộ mã hoá ảnh lai CNN–Transformer, đầu vào 256×256, đầu ra vector 512 chiều. Hướng zero-shot bằng mô hình thị giác – ngôn ngữ cũng đã được áp dụng cho phân loại rác nhựa trong [6].</w:t>
       </w:r>
     </w:p>
     <w:p>
@@ -408,7 +408,7 @@
           <w:b w:val="0"/>
           <w:i w:val="0"/>
         </w:rPr>
-        <w:t>TensorFlow Lite (LiteRT) là môi trường chạy mô hình học sâu trên thiết bị. Delegate cho phép chuyển tính toán sang GPU (OpenCL/OpenGL) để tăng tốc. Lượng tử hoá giảm độ chính xác số của trọng số: FP16 (16 bit) giảm một nửa dung lượng; INT8 dynamic range lưu trọng số 8 bit và giải lượng tử khi chạy; lượng tử hoá nguyên hoàn toàn [6] tính toán hoàn toàn bằng số nguyên nên nhanh nhất trên phần cứng di động.</w:t>
+        <w:t>TensorFlow Lite (LiteRT) là môi trường chạy mô hình học sâu trên thiết bị. Delegate cho phép chuyển tính toán sang GPU (OpenCL/OpenGL) để tăng tốc. Lượng tử hoá giảm độ chính xác số của trọng số: FP16 (16 bit) giảm một nửa dung lượng; INT8 dynamic range lưu trọng số 8 bit và giải lượng tử khi chạy; lượng tử hoá nguyên hoàn toàn [5] tính toán hoàn toàn bằng số nguyên nên nhanh nhất trên phần cứng di động.</w:t>
       </w:r>
     </w:p>
     <w:p>
@@ -446,7 +446,7 @@
         <w:t xml:space="preserve">Bài toán người du lịch (TSP): </w:t>
       </w:r>
       <w:r>
-        <w:t>tìm thứ tự ghé thăm các điểm có tổng quãng đường nhỏ nhất — bài toán NP-khó. Với vài chục điểm, heuristic láng giềng gần nhất (luôn đi tới điểm gần nhất chưa ghé) kết hợp cải thiện 2-opt [8] (đảo ngược một đoạn đường nếu làm tổng quãng đường ngắn lại) cho lời giải gần tối ưu trong thời gian rất ngắn.</w:t>
+        <w:t>tìm thứ tự ghé thăm các điểm có tổng quãng đường nhỏ nhất — bài toán NP-khó. Với vài chục điểm, heuristic láng giềng gần nhất (luôn đi tới điểm gần nhất chưa ghé) kết hợp cải thiện 2-opt [7] (đảo ngược một đoạn đường nếu làm tổng quãng đường ngắn lại) cho lời giải gần tối ưu trong thời gian rất ngắn.</w:t>
       </w:r>
     </w:p>
     <w:p>

</xml_diff>